<commit_message>
Update C.V. Carl Michael Galang.docx
</commit_message>
<xml_diff>
--- a/documents/source/C.V. Carl Michael Galang.docx
+++ b/documents/source/C.V. Carl Michael Galang.docx
@@ -77,7 +77,23 @@
           <w:sz w:val="24"/>
           <w:szCs w:val="24"/>
         </w:rPr>
-        <w:t>9/08/2026</w:t>
+        <w:t>9/</w:t>
+      </w:r>
+      <w:r>
+        <w:rPr>
+          <w:rFonts w:ascii="Times New Roman" w:hAnsi="Times New Roman" w:cs="Times New Roman"/>
+          <w:sz w:val="24"/>
+          <w:szCs w:val="24"/>
+        </w:rPr>
+        <w:t>13</w:t>
+      </w:r>
+      <w:r>
+        <w:rPr>
+          <w:rFonts w:ascii="Times New Roman" w:hAnsi="Times New Roman" w:cs="Times New Roman"/>
+          <w:sz w:val="24"/>
+          <w:szCs w:val="24"/>
+        </w:rPr>
+        <w:t>/2026</w:t>
       </w:r>
     </w:p>
     <w:p>
@@ -3256,7 +3272,7 @@
           <w:bCs/>
           <w:lang w:val="en-CA"/>
         </w:rPr>
-        <w:t>Sabine Bou Saba</w:t>
+        <w:t>Bou Saba, S.</w:t>
       </w:r>
       <w:r>
         <w:rPr>
@@ -3601,7 +3617,7 @@
           <w:rFonts w:ascii="Times New Roman" w:hAnsi="Times New Roman" w:cs="Times New Roman"/>
           <w:bCs/>
         </w:rPr>
-        <w:t>.). Development and validation of the Epistemic Stance Test for generative AI (EST-GenAI).</w:t>
+        <w:t>.). Development and validation of the Epistemic Stance Test for AI (EST-AI).</w:t>
       </w:r>
     </w:p>
     <w:p>
@@ -3738,7 +3754,7 @@
           <w:bCs/>
           <w:lang w:val="en-CA"/>
         </w:rPr>
-        <w:t xml:space="preserve">Saba, S., </w:t>
+        <w:t xml:space="preserve">Bou Saba, S., </w:t>
       </w:r>
       <w:r>
         <w:rPr>
@@ -3754,7 +3770,7 @@
           <w:bCs/>
           <w:lang w:val="en-CA"/>
         </w:rPr>
-        <w:t xml:space="preserve">&amp; Brass (In Prep.). </w:t>
+        <w:t xml:space="preserve">&amp; Brass, M. (In Prep.). </w:t>
       </w:r>
       <w:r>
         <w:rPr>
@@ -3875,7 +3891,7 @@
         <w:rPr>
           <w:rFonts w:ascii="Times New Roman" w:hAnsi="Times New Roman" w:cs="Times New Roman"/>
         </w:rPr>
-        <w:t>€‎173, 847</w:t>
+        <w:t>€‎173,847</w:t>
       </w:r>
     </w:p>
     <w:p>
@@ -3959,7 +3975,7 @@
         <w:rPr>
           <w:rFonts w:ascii="Times New Roman" w:hAnsi="Times New Roman" w:cs="Times New Roman"/>
         </w:rPr>
-        <w:t>$42, 000</w:t>
+        <w:t>$42,000</w:t>
       </w:r>
     </w:p>
     <w:p>
@@ -4031,7 +4047,7 @@
         <w:rPr>
           <w:rFonts w:ascii="Times New Roman" w:hAnsi="Times New Roman" w:cs="Times New Roman"/>
         </w:rPr>
-        <w:t>$15 000</w:t>
+        <w:t>$15,000</w:t>
       </w:r>
     </w:p>
     <w:p>
@@ -4103,7 +4119,7 @@
         <w:rPr>
           <w:rFonts w:ascii="Times New Roman" w:hAnsi="Times New Roman" w:cs="Times New Roman"/>
         </w:rPr>
-        <w:t>$12 000</w:t>
+        <w:t>$12,000</w:t>
       </w:r>
     </w:p>
     <w:p>
@@ -4181,7 +4197,7 @@
         <w:rPr>
           <w:rFonts w:ascii="Times New Roman" w:hAnsi="Times New Roman" w:cs="Times New Roman"/>
         </w:rPr>
-        <w:t>$17 500</w:t>
+        <w:t>$17,500</w:t>
       </w:r>
     </w:p>
     <w:p>
@@ -4697,7 +4713,14 @@
         <w:rPr>
           <w:rFonts w:ascii="Times New Roman" w:hAnsi="Times New Roman" w:cs="Times New Roman"/>
         </w:rPr>
-        <w:t>, &amp; Obhi, S.S. (2018). Visual Perspective Taking in Pain Observation: Evidence from Event-Related Potentials. Poster presented at the Joint Meeting of the Canadian Society for Brain, Behaviour, and Cognitive Sciences (CSBBCS) and the Experimental Psychology Society (EPS). St. Johns, Canada.</w:t>
+        <w:t xml:space="preserve">, &amp; Obhi, S.S. (2018). Visual Perspective Taking in Pain Observation: Evidence from Event-Related Potentials. Poster presented at the Joint Meeting of the Canadian Society for Brain, </w:t>
+      </w:r>
+      <w:r>
+        <w:rPr>
+          <w:rFonts w:ascii="Times New Roman" w:hAnsi="Times New Roman" w:cs="Times New Roman"/>
+        </w:rPr>
+        <w:lastRenderedPageBreak/>
+        <w:t>Behaviour, and Cognitive Sciences (CSBBCS) and the Experimental Psychology Society (EPS). St. Johns, Canada.</w:t>
       </w:r>
     </w:p>
     <w:p>

</xml_diff>

<commit_message>
Update CV: gender bias paper now under review at PNAS
Moves the multimodal LLM gender bias paper from Preprints to Under
Review, matching the publications section on index.html.

Co-Authored-By: Claude Opus 5 (1M context) <noreply@anthropic.com>
</commit_message>
<xml_diff>
--- a/documents/source/C.V. Carl Michael Galang.docx
+++ b/documents/source/C.V. Carl Michael Galang.docx
@@ -85,7 +85,7 @@
           <w:sz w:val="24"/>
           <w:szCs w:val="24"/>
         </w:rPr>
-        <w:t>13</w:t>
+        <w:t>28</w:t>
       </w:r>
       <w:r>
         <w:rPr>
@@ -788,7 +788,6 @@
         </w:rPr>
         <w:tab/>
       </w:r>
-      <w:proofErr w:type="gramStart"/>
       <w:r>
         <w:rPr>
           <w:rFonts w:ascii="Times New Roman" w:hAnsi="Times New Roman" w:cs="Times New Roman"/>
@@ -796,7 +795,6 @@
         <w:tab/>
         <w:t xml:space="preserve">  Oct.</w:t>
       </w:r>
-      <w:proofErr w:type="gramEnd"/>
       <w:r>
         <w:rPr>
           <w:rFonts w:ascii="Times New Roman" w:hAnsi="Times New Roman" w:cs="Times New Roman"/>
@@ -3089,6 +3087,186 @@
     <w:p>
       <w:pPr>
         <w:spacing w:after="0" w:line="240" w:lineRule="auto"/>
+        <w:jc w:val="both"/>
+        <w:outlineLvl w:val="0"/>
+        <w:rPr>
+          <w:rFonts w:ascii="Times New Roman" w:hAnsi="Times New Roman" w:cs="Times New Roman"/>
+          <w:bCs/>
+          <w:lang w:val="en-CA"/>
+        </w:rPr>
+      </w:pPr>
+    </w:p>
+    <w:p>
+      <w:pPr>
+        <w:spacing w:after="0" w:line="240" w:lineRule="auto"/>
+        <w:jc w:val="both"/>
+        <w:outlineLvl w:val="0"/>
+        <w:rPr>
+          <w:rFonts w:ascii="Times New Roman" w:hAnsi="Times New Roman" w:cs="Times New Roman"/>
+          <w:lang w:val="en-CA"/>
+        </w:rPr>
+      </w:pPr>
+      <w:r>
+        <w:rPr>
+          <w:rFonts w:ascii="Times New Roman" w:hAnsi="Times New Roman" w:cs="Times New Roman"/>
+          <w:bCs/>
+          <w:lang w:val="en-CA"/>
+        </w:rPr>
+        <w:t>Nisanci, S.,</w:t>
+      </w:r>
+      <w:r>
+        <w:rPr>
+          <w:rFonts w:ascii="Times New Roman" w:hAnsi="Times New Roman" w:cs="Times New Roman"/>
+          <w:bCs/>
+          <w:lang w:val="en-CA"/>
+        </w:rPr>
+        <w:t xml:space="preserve"> </w:t>
+      </w:r>
+      <w:r>
+        <w:rPr>
+          <w:rFonts w:ascii="Times New Roman" w:hAnsi="Times New Roman" w:cs="Times New Roman"/>
+          <w:bCs/>
+          <w:lang w:val="en-CA"/>
+        </w:rPr>
+        <w:t>Bou Saba, S.</w:t>
+      </w:r>
+      <w:r>
+        <w:rPr>
+          <w:rFonts w:ascii="Times New Roman" w:hAnsi="Times New Roman" w:cs="Times New Roman"/>
+          <w:bCs/>
+          <w:lang w:val="en-CA"/>
+        </w:rPr>
+        <w:t>,</w:t>
+      </w:r>
+      <w:r>
+        <w:rPr>
+          <w:rFonts w:ascii="Times New Roman" w:hAnsi="Times New Roman" w:cs="Times New Roman"/>
+          <w:bCs/>
+          <w:lang w:val="en-CA"/>
+        </w:rPr>
+        <w:t xml:space="preserve"> </w:t>
+      </w:r>
+      <w:r>
+        <w:rPr>
+          <w:rFonts w:ascii="Times New Roman" w:hAnsi="Times New Roman" w:cs="Times New Roman"/>
+          <w:b/>
+          <w:lang w:val="en-CA"/>
+        </w:rPr>
+        <w:t>Galang, C.M.</w:t>
+      </w:r>
+      <w:r>
+        <w:rPr>
+          <w:rFonts w:ascii="Times New Roman" w:hAnsi="Times New Roman" w:cs="Times New Roman"/>
+          <w:bCs/>
+          <w:lang w:val="en-CA"/>
+        </w:rPr>
+        <w:t xml:space="preserve">, &amp; </w:t>
+      </w:r>
+      <w:r>
+        <w:rPr>
+          <w:rFonts w:ascii="Times New Roman" w:hAnsi="Times New Roman" w:cs="Times New Roman"/>
+          <w:bCs/>
+          <w:lang w:val="en-CA"/>
+        </w:rPr>
+        <w:t>Brass, M.,</w:t>
+      </w:r>
+      <w:r>
+        <w:rPr>
+          <w:rFonts w:ascii="Times New Roman" w:hAnsi="Times New Roman" w:cs="Times New Roman"/>
+          <w:bCs/>
+          <w:lang w:val="en-CA"/>
+        </w:rPr>
+        <w:t xml:space="preserve"> </w:t>
+      </w:r>
+      <w:r>
+        <w:rPr>
+          <w:rFonts w:ascii="Times New Roman" w:hAnsi="Times New Roman" w:cs="Times New Roman"/>
+          <w:bCs/>
+          <w:lang w:val="en-CA"/>
+        </w:rPr>
+        <w:t>(</w:t>
+      </w:r>
+      <w:r>
+        <w:rPr>
+          <w:rFonts w:ascii="Times New Roman" w:hAnsi="Times New Roman" w:cs="Times New Roman"/>
+          <w:bCs/>
+          <w:lang w:val="en-CA"/>
+        </w:rPr>
+        <w:t>Under Review</w:t>
+      </w:r>
+      <w:r>
+        <w:rPr>
+          <w:rFonts w:ascii="Times New Roman" w:hAnsi="Times New Roman" w:cs="Times New Roman"/>
+          <w:bCs/>
+          <w:lang w:val="en-CA"/>
+        </w:rPr>
+        <w:t>).</w:t>
+      </w:r>
+      <w:r>
+        <w:rPr>
+          <w:rFonts w:ascii="Times New Roman" w:hAnsi="Times New Roman" w:cs="Times New Roman"/>
+          <w:bCs/>
+          <w:lang w:val="en-CA"/>
+        </w:rPr>
+        <w:t xml:space="preserve"> </w:t>
+      </w:r>
+      <w:r>
+        <w:rPr>
+          <w:rFonts w:ascii="Times New Roman" w:hAnsi="Times New Roman" w:cs="Times New Roman"/>
+        </w:rPr>
+        <w:t>Multimodal Large Language Models Encode Implicit Gender Bias</w:t>
+      </w:r>
+      <w:r>
+        <w:rPr>
+          <w:rFonts w:ascii="Times New Roman" w:hAnsi="Times New Roman" w:cs="Times New Roman"/>
+        </w:rPr>
+        <w:t>.</w:t>
+      </w:r>
+      <w:r>
+        <w:rPr>
+          <w:rFonts w:ascii="Times New Roman" w:hAnsi="Times New Roman" w:cs="Times New Roman"/>
+        </w:rPr>
+        <w:t xml:space="preserve"> </w:t>
+      </w:r>
+      <w:r>
+        <w:rPr>
+          <w:rFonts w:ascii="Times New Roman" w:hAnsi="Times New Roman" w:cs="Times New Roman"/>
+          <w:i/>
+          <w:iCs/>
+        </w:rPr>
+        <w:t>PNAS</w:t>
+      </w:r>
+      <w:r>
+        <w:rPr>
+          <w:rFonts w:ascii="Times New Roman" w:hAnsi="Times New Roman" w:cs="Times New Roman"/>
+        </w:rPr>
+        <w:t>. Preprint:</w:t>
+      </w:r>
+      <w:r>
+        <w:rPr>
+          <w:rFonts w:ascii="Times New Roman" w:hAnsi="Times New Roman" w:cs="Times New Roman"/>
+        </w:rPr>
+        <w:t xml:space="preserve"> </w:t>
+      </w:r>
+      <w:hyperlink r:id="rId10" w:history="1">
+        <w:r>
+          <w:rPr>
+            <w:rStyle w:val="Hyperlink"/>
+            <w:rFonts w:ascii="Times New Roman" w:hAnsi="Times New Roman" w:cs="Times New Roman"/>
+          </w:rPr>
+          <w:t>https://doi.org/10.31234/osf.io/gbnfq_v1</w:t>
+        </w:r>
+      </w:hyperlink>
+      <w:r>
+        <w:rPr>
+          <w:rFonts w:ascii="Times New Roman" w:hAnsi="Times New Roman" w:cs="Times New Roman"/>
+        </w:rPr>
+        <w:t xml:space="preserve"> </w:t>
+      </w:r>
+    </w:p>
+    <w:p>
+      <w:pPr>
+        <w:spacing w:after="0" w:line="240" w:lineRule="auto"/>
         <w:outlineLvl w:val="0"/>
         <w:rPr>
           <w:rFonts w:ascii="Times New Roman" w:hAnsi="Times New Roman" w:cs="Times New Roman"/>
@@ -3218,7 +3396,7 @@
         </w:rPr>
         <w:t xml:space="preserve"> </w:t>
       </w:r>
-      <w:hyperlink r:id="rId10" w:history="1">
+      <w:hyperlink r:id="rId11" w:history="1">
         <w:r>
           <w:rPr>
             <w:rStyle w:val="Hyperlink"/>
@@ -3228,159 +3406,6 @@
         </w:r>
       </w:hyperlink>
       <w:r>
-        <w:t xml:space="preserve"> </w:t>
-      </w:r>
-    </w:p>
-    <w:p>
-      <w:pPr>
-        <w:spacing w:after="0" w:line="240" w:lineRule="auto"/>
-        <w:jc w:val="both"/>
-        <w:outlineLvl w:val="0"/>
-        <w:rPr>
-          <w:rFonts w:ascii="Times New Roman" w:hAnsi="Times New Roman" w:cs="Times New Roman"/>
-          <w:bCs/>
-        </w:rPr>
-      </w:pPr>
-    </w:p>
-    <w:p>
-      <w:pPr>
-        <w:spacing w:after="0" w:line="240" w:lineRule="auto"/>
-        <w:jc w:val="both"/>
-        <w:outlineLvl w:val="0"/>
-        <w:rPr>
-          <w:rFonts w:ascii="Times New Roman" w:hAnsi="Times New Roman" w:cs="Times New Roman"/>
-          <w:lang w:val="en-CA"/>
-        </w:rPr>
-      </w:pPr>
-      <w:r>
-        <w:rPr>
-          <w:rFonts w:ascii="Times New Roman" w:hAnsi="Times New Roman" w:cs="Times New Roman"/>
-          <w:bCs/>
-          <w:lang w:val="en-CA"/>
-        </w:rPr>
-        <w:t>Nisanci, S.,</w:t>
-      </w:r>
-      <w:r>
-        <w:rPr>
-          <w:rFonts w:ascii="Times New Roman" w:hAnsi="Times New Roman" w:cs="Times New Roman"/>
-          <w:bCs/>
-          <w:lang w:val="en-CA"/>
-        </w:rPr>
-        <w:t xml:space="preserve"> </w:t>
-      </w:r>
-      <w:r>
-        <w:rPr>
-          <w:rFonts w:ascii="Times New Roman" w:hAnsi="Times New Roman" w:cs="Times New Roman"/>
-          <w:bCs/>
-          <w:lang w:val="en-CA"/>
-        </w:rPr>
-        <w:t>Bou Saba, S.</w:t>
-      </w:r>
-      <w:r>
-        <w:rPr>
-          <w:rFonts w:ascii="Times New Roman" w:hAnsi="Times New Roman" w:cs="Times New Roman"/>
-          <w:bCs/>
-          <w:lang w:val="en-CA"/>
-        </w:rPr>
-        <w:t>,</w:t>
-      </w:r>
-      <w:r>
-        <w:rPr>
-          <w:rFonts w:ascii="Times New Roman" w:hAnsi="Times New Roman" w:cs="Times New Roman"/>
-          <w:bCs/>
-          <w:lang w:val="en-CA"/>
-        </w:rPr>
-        <w:t xml:space="preserve"> </w:t>
-      </w:r>
-      <w:r>
-        <w:rPr>
-          <w:rFonts w:ascii="Times New Roman" w:hAnsi="Times New Roman" w:cs="Times New Roman"/>
-          <w:b/>
-          <w:lang w:val="en-CA"/>
-        </w:rPr>
-        <w:t>Galang, C.M.</w:t>
-      </w:r>
-      <w:r>
-        <w:rPr>
-          <w:rFonts w:ascii="Times New Roman" w:hAnsi="Times New Roman" w:cs="Times New Roman"/>
-          <w:bCs/>
-          <w:lang w:val="en-CA"/>
-        </w:rPr>
-        <w:t xml:space="preserve">, &amp; </w:t>
-      </w:r>
-      <w:r>
-        <w:rPr>
-          <w:rFonts w:ascii="Times New Roman" w:hAnsi="Times New Roman" w:cs="Times New Roman"/>
-          <w:bCs/>
-          <w:lang w:val="en-CA"/>
-        </w:rPr>
-        <w:t>Brass, M.,</w:t>
-      </w:r>
-      <w:r>
-        <w:rPr>
-          <w:rFonts w:ascii="Times New Roman" w:hAnsi="Times New Roman" w:cs="Times New Roman"/>
-          <w:bCs/>
-          <w:lang w:val="en-CA"/>
-        </w:rPr>
-        <w:t xml:space="preserve"> </w:t>
-      </w:r>
-      <w:r>
-        <w:rPr>
-          <w:rFonts w:ascii="Times New Roman" w:hAnsi="Times New Roman" w:cs="Times New Roman"/>
-          <w:bCs/>
-          <w:lang w:val="en-CA"/>
-        </w:rPr>
-        <w:t>(</w:t>
-      </w:r>
-      <w:r>
-        <w:rPr>
-          <w:rFonts w:ascii="Times New Roman" w:hAnsi="Times New Roman" w:cs="Times New Roman"/>
-          <w:bCs/>
-          <w:lang w:val="en-CA"/>
-        </w:rPr>
-        <w:t>2026</w:t>
-      </w:r>
-      <w:r>
-        <w:rPr>
-          <w:rFonts w:ascii="Times New Roman" w:hAnsi="Times New Roman" w:cs="Times New Roman"/>
-          <w:bCs/>
-          <w:lang w:val="en-CA"/>
-        </w:rPr>
-        <w:t>).</w:t>
-      </w:r>
-      <w:r>
-        <w:rPr>
-          <w:rFonts w:ascii="Times New Roman" w:hAnsi="Times New Roman" w:cs="Times New Roman"/>
-          <w:bCs/>
-          <w:lang w:val="en-CA"/>
-        </w:rPr>
-        <w:t xml:space="preserve"> </w:t>
-      </w:r>
-      <w:r>
-        <w:rPr>
-          <w:rFonts w:ascii="Times New Roman" w:hAnsi="Times New Roman" w:cs="Times New Roman"/>
-        </w:rPr>
-        <w:t>Multimodal Large Language Models Encode Implicit Gender Bias</w:t>
-      </w:r>
-      <w:r>
-        <w:rPr>
-          <w:rFonts w:ascii="Times New Roman" w:hAnsi="Times New Roman" w:cs="Times New Roman"/>
-        </w:rPr>
-        <w:t xml:space="preserve">. </w:t>
-      </w:r>
-      <w:hyperlink r:id="rId11" w:history="1">
-        <w:r>
-          <w:rPr>
-            <w:rStyle w:val="Hyperlink"/>
-            <w:rFonts w:ascii="Times New Roman" w:hAnsi="Times New Roman" w:cs="Times New Roman"/>
-          </w:rPr>
-          <w:t>https://doi.org/10.31234/osf.io/gbnfq_v1</w:t>
-        </w:r>
-      </w:hyperlink>
-      <w:r>
-        <w:rPr>
-          <w:rFonts w:ascii="Times New Roman" w:hAnsi="Times New Roman" w:cs="Times New Roman"/>
-        </w:rPr>
         <w:t xml:space="preserve"> </w:t>
       </w:r>
     </w:p>
@@ -4033,16 +4058,8 @@
         <w:rPr>
           <w:rFonts w:ascii="Times New Roman" w:hAnsi="Times New Roman" w:cs="Times New Roman"/>
         </w:rPr>
-        <w:t xml:space="preserve">Joyce Ontario Graduate Scholarship (OGS) in </w:t>
-      </w:r>
-      <w:proofErr w:type="gramStart"/>
-      <w:r>
-        <w:rPr>
-          <w:rFonts w:ascii="Times New Roman" w:hAnsi="Times New Roman" w:cs="Times New Roman"/>
-        </w:rPr>
-        <w:t>Science</w:t>
-      </w:r>
-      <w:proofErr w:type="gramEnd"/>
+        <w:t>Joyce Ontario Graduate Scholarship (OGS) in Science</w:t>
+      </w:r>
     </w:p>
     <w:p>
       <w:pPr>
@@ -4715,21 +4732,7 @@
         <w:rPr>
           <w:rFonts w:ascii="Times New Roman" w:hAnsi="Times New Roman" w:cs="Times New Roman"/>
         </w:rPr>
-        <w:t xml:space="preserve"> &amp; Obhi, S.S. (2018). Observed Pain Intensity and Instructions to </w:t>
-      </w:r>
-      <w:proofErr w:type="gramStart"/>
-      <w:r>
-        <w:rPr>
-          <w:rFonts w:ascii="Times New Roman" w:hAnsi="Times New Roman" w:cs="Times New Roman"/>
-        </w:rPr>
-        <w:t>Empathize</w:t>
-      </w:r>
-      <w:proofErr w:type="gramEnd"/>
-      <w:r>
-        <w:rPr>
-          <w:rFonts w:ascii="Times New Roman" w:hAnsi="Times New Roman" w:cs="Times New Roman"/>
-        </w:rPr>
-        <w:t xml:space="preserve"> Modulate Response Facilitation. Poster presented at the Joint Meeting of the Canadian Society for Brain, Behaviour, and Cognitive Sciences (CSBBCS) and the Experimental Psychology Society (EPS). St. Johns, Canada.</w:t>
+        <w:t xml:space="preserve"> &amp; Obhi, S.S. (2018). Observed Pain Intensity and Instructions to Empathize Modulate Response Facilitation. Poster presented at the Joint Meeting of the Canadian Society for Brain, Behaviour, and Cognitive Sciences (CSBBCS) and the Experimental Psychology Society (EPS). St. Johns, Canada.</w:t>
       </w:r>
     </w:p>
     <w:p>

</xml_diff>

<commit_message>
Add The Face of Agency (under review) to CV and index
Co-Authored-By: Claude Opus 5.5 (1M context) <noreply@anthropic.com>
</commit_message>
<xml_diff>
--- a/documents/source/C.V. Carl Michael Galang.docx
+++ b/documents/source/C.V. Carl Michael Galang.docx
@@ -69,7 +69,7 @@
           <w:sz w:val="24"/>
           <w:szCs w:val="24"/>
         </w:rPr>
-        <w:t>0</w:t>
+        <w:t>10</w:t>
       </w:r>
       <w:r>
         <w:rPr>
@@ -77,7 +77,7 @@
           <w:sz w:val="24"/>
           <w:szCs w:val="24"/>
         </w:rPr>
-        <w:t>9/</w:t>
+        <w:t>/</w:t>
       </w:r>
       <w:r>
         <w:rPr>
@@ -85,7 +85,7 @@
           <w:sz w:val="24"/>
           <w:szCs w:val="24"/>
         </w:rPr>
-        <w:t>28</w:t>
+        <w:t>21</w:t>
       </w:r>
       <w:r>
         <w:rPr>
@@ -2980,7 +2980,7 @@
           <w:bCs/>
           <w:lang w:val="en-CA"/>
         </w:rPr>
-        <w:t xml:space="preserve">Nisanci, S., Formica, S., Brass, M., &amp; </w:t>
+        <w:t xml:space="preserve">Bou Saba, S., </w:t>
       </w:r>
       <w:r>
         <w:rPr>
@@ -2996,47 +2996,7 @@
           <w:bCs/>
           <w:lang w:val="en-CA"/>
         </w:rPr>
-        <w:t xml:space="preserve"> (</w:t>
-      </w:r>
-      <w:r>
-        <w:rPr>
-          <w:rFonts w:ascii="Times New Roman" w:hAnsi="Times New Roman" w:cs="Times New Roman"/>
-          <w:bCs/>
-          <w:lang w:val="en-CA"/>
-        </w:rPr>
-        <w:t>Under Review</w:t>
-      </w:r>
-      <w:r>
-        <w:rPr>
-          <w:rFonts w:ascii="Times New Roman" w:hAnsi="Times New Roman" w:cs="Times New Roman"/>
-          <w:bCs/>
-          <w:lang w:val="en-CA"/>
-        </w:rPr>
-        <w:t>).</w:t>
-      </w:r>
-      <w:r>
-        <w:rPr>
-          <w:rFonts w:ascii="Times New Roman" w:hAnsi="Times New Roman" w:cs="Times New Roman"/>
-          <w:bCs/>
-          <w:lang w:val="en-CA"/>
-        </w:rPr>
-        <w:t xml:space="preserve"> The Sense of Agency During Collective Rule-Breaking</w:t>
-      </w:r>
-      <w:r>
-        <w:rPr>
-          <w:rFonts w:ascii="Times New Roman" w:hAnsi="Times New Roman" w:cs="Times New Roman"/>
-          <w:bCs/>
-          <w:lang w:val="en-CA"/>
-        </w:rPr>
-        <w:t>.</w:t>
-      </w:r>
-      <w:r>
-        <w:rPr>
-          <w:rFonts w:ascii="Times New Roman" w:hAnsi="Times New Roman" w:cs="Times New Roman"/>
-          <w:bCs/>
-          <w:lang w:val="en-CA"/>
-        </w:rPr>
-        <w:t xml:space="preserve"> </w:t>
+        <w:t xml:space="preserve">, &amp; Brass, M. (Under Review). The Face of Agency: A Reverse Correlation Study. </w:t>
       </w:r>
       <w:r>
         <w:rPr>
@@ -3046,6 +3006,131 @@
           <w:iCs/>
           <w:lang w:val="en-CA"/>
         </w:rPr>
+        <w:t>Communications Psychology</w:t>
+      </w:r>
+      <w:r>
+        <w:rPr>
+          <w:rFonts w:ascii="Times New Roman" w:hAnsi="Times New Roman" w:cs="Times New Roman"/>
+          <w:bCs/>
+          <w:lang w:val="en-CA"/>
+        </w:rPr>
+        <w:t xml:space="preserve">. Preprint: </w:t>
+      </w:r>
+      <w:hyperlink r:id="rId9" w:history="1">
+        <w:r>
+          <w:rPr>
+            <w:rStyle w:val="Hyperlink"/>
+            <w:rFonts w:ascii="Times New Roman" w:hAnsi="Times New Roman" w:cs="Times New Roman"/>
+            <w:bCs/>
+            <w:lang w:val="en-CA"/>
+          </w:rPr>
+          <w:t>https://osf.io/preprints/psyarxiv/3rvnt_v1</w:t>
+        </w:r>
+      </w:hyperlink>
+      <w:r>
+        <w:rPr>
+          <w:rFonts w:ascii="Times New Roman" w:hAnsi="Times New Roman" w:cs="Times New Roman"/>
+          <w:bCs/>
+          <w:lang w:val="en-CA"/>
+        </w:rPr>
+        <w:t xml:space="preserve"> </w:t>
+      </w:r>
+    </w:p>
+    <w:p>
+      <w:pPr>
+        <w:spacing w:after="0" w:line="240" w:lineRule="auto"/>
+        <w:jc w:val="both"/>
+        <w:outlineLvl w:val="0"/>
+        <w:rPr>
+          <w:rFonts w:ascii="Times New Roman" w:hAnsi="Times New Roman" w:cs="Times New Roman"/>
+          <w:bCs/>
+          <w:lang w:val="en-CA"/>
+        </w:rPr>
+      </w:pPr>
+    </w:p>
+    <w:p>
+      <w:pPr>
+        <w:spacing w:after="0" w:line="240" w:lineRule="auto"/>
+        <w:jc w:val="both"/>
+        <w:outlineLvl w:val="0"/>
+        <w:rPr>
+          <w:rFonts w:ascii="Times New Roman" w:hAnsi="Times New Roman" w:cs="Times New Roman"/>
+          <w:bCs/>
+          <w:lang w:val="en-CA"/>
+        </w:rPr>
+      </w:pPr>
+      <w:r>
+        <w:rPr>
+          <w:rFonts w:ascii="Times New Roman" w:hAnsi="Times New Roman" w:cs="Times New Roman"/>
+          <w:bCs/>
+          <w:lang w:val="en-CA"/>
+        </w:rPr>
+        <w:t xml:space="preserve">Nisanci, S., Formica, S., Brass, M., &amp; </w:t>
+      </w:r>
+      <w:r>
+        <w:rPr>
+          <w:rFonts w:ascii="Times New Roman" w:hAnsi="Times New Roman" w:cs="Times New Roman"/>
+          <w:b/>
+          <w:lang w:val="en-CA"/>
+        </w:rPr>
+        <w:t>Galang, C.M.</w:t>
+      </w:r>
+      <w:r>
+        <w:rPr>
+          <w:rFonts w:ascii="Times New Roman" w:hAnsi="Times New Roman" w:cs="Times New Roman"/>
+          <w:bCs/>
+          <w:lang w:val="en-CA"/>
+        </w:rPr>
+        <w:t xml:space="preserve"> (</w:t>
+      </w:r>
+      <w:r>
+        <w:rPr>
+          <w:rFonts w:ascii="Times New Roman" w:hAnsi="Times New Roman" w:cs="Times New Roman"/>
+          <w:bCs/>
+          <w:lang w:val="en-CA"/>
+        </w:rPr>
+        <w:t>Under Review</w:t>
+      </w:r>
+      <w:r>
+        <w:rPr>
+          <w:rFonts w:ascii="Times New Roman" w:hAnsi="Times New Roman" w:cs="Times New Roman"/>
+          <w:bCs/>
+          <w:lang w:val="en-CA"/>
+        </w:rPr>
+        <w:t>).</w:t>
+      </w:r>
+      <w:r>
+        <w:rPr>
+          <w:rFonts w:ascii="Times New Roman" w:hAnsi="Times New Roman" w:cs="Times New Roman"/>
+          <w:bCs/>
+          <w:lang w:val="en-CA"/>
+        </w:rPr>
+        <w:t xml:space="preserve"> The Sense of Agency During Collective Rule-Breaking</w:t>
+      </w:r>
+      <w:r>
+        <w:rPr>
+          <w:rFonts w:ascii="Times New Roman" w:hAnsi="Times New Roman" w:cs="Times New Roman"/>
+          <w:bCs/>
+          <w:lang w:val="en-CA"/>
+        </w:rPr>
+        <w:t>.</w:t>
+      </w:r>
+      <w:r>
+        <w:rPr>
+          <w:rFonts w:ascii="Times New Roman" w:hAnsi="Times New Roman" w:cs="Times New Roman"/>
+          <w:bCs/>
+          <w:lang w:val="en-CA"/>
+        </w:rPr>
+        <w:t xml:space="preserve"> </w:t>
+      </w:r>
+      <w:r>
+        <w:rPr>
+          <w:rFonts w:ascii="Times New Roman" w:hAnsi="Times New Roman" w:cs="Times New Roman"/>
+          <w:bCs/>
+          <w:i/>
+          <w:iCs/>
+          <w:lang w:val="en-CA"/>
+        </w:rPr>
         <w:t>Cognition</w:t>
       </w:r>
       <w:r>
@@ -3064,7 +3149,7 @@
         </w:rPr>
         <w:t xml:space="preserve"> Preprint: </w:t>
       </w:r>
-      <w:hyperlink r:id="rId9" w:history="1">
+      <w:hyperlink r:id="rId10" w:history="1">
         <w:r>
           <w:rPr>
             <w:rStyle w:val="Hyperlink"/>
@@ -3248,7 +3333,7 @@
         </w:rPr>
         <w:t xml:space="preserve"> </w:t>
       </w:r>
-      <w:hyperlink r:id="rId10" w:history="1">
+      <w:hyperlink r:id="rId11" w:history="1">
         <w:r>
           <w:rPr>
             <w:rStyle w:val="Hyperlink"/>
@@ -3396,7 +3481,7 @@
         </w:rPr>
         <w:t xml:space="preserve"> </w:t>
       </w:r>
-      <w:hyperlink r:id="rId11" w:history="1">
+      <w:hyperlink r:id="rId12" w:history="1">
         <w:r>
           <w:rPr>
             <w:rStyle w:val="Hyperlink"/>
@@ -3468,7 +3553,7 @@
         </w:rPr>
         <w:t xml:space="preserve">). When the clock lies: Intention reports can be biased by authoritative suggestion. </w:t>
       </w:r>
-      <w:hyperlink r:id="rId12" w:history="1">
+      <w:hyperlink r:id="rId13" w:history="1">
         <w:r>
           <w:rPr>
             <w:rStyle w:val="Hyperlink"/>
@@ -3563,7 +3648,7 @@
         </w:rPr>
         <w:t xml:space="preserve">). Introducing a Framework for Open and Reproducible Research Training (FORRT). </w:t>
       </w:r>
-      <w:hyperlink r:id="rId13" w:history="1">
+      <w:hyperlink r:id="rId14" w:history="1">
         <w:r>
           <w:rPr>
             <w:rStyle w:val="Hyperlink"/>
@@ -4758,6 +4843,7 @@
         <w:rPr>
           <w:rFonts w:ascii="Times New Roman" w:hAnsi="Times New Roman" w:cs="Times New Roman"/>
         </w:rPr>
+        <w:lastRenderedPageBreak/>
         <w:t xml:space="preserve">Jenkins, M., </w:t>
       </w:r>
       <w:r>
@@ -4772,14 +4858,7 @@
         <w:rPr>
           <w:rFonts w:ascii="Times New Roman" w:hAnsi="Times New Roman" w:cs="Times New Roman"/>
         </w:rPr>
-        <w:t xml:space="preserve">, &amp; Obhi, S.S. (2018). Visual Perspective Taking in Pain Observation: Evidence from Event-Related Potentials. Poster presented at the Joint Meeting of the Canadian Society for Brain, </w:t>
-      </w:r>
-      <w:r>
-        <w:rPr>
-          <w:rFonts w:ascii="Times New Roman" w:hAnsi="Times New Roman" w:cs="Times New Roman"/>
-        </w:rPr>
-        <w:lastRenderedPageBreak/>
-        <w:t>Behaviour, and Cognitive Sciences (CSBBCS) and the Experimental Psychology Society (EPS). St. Johns, Canada.</w:t>
+        <w:t>, &amp; Obhi, S.S. (2018). Visual Perspective Taking in Pain Observation: Evidence from Event-Related Potentials. Poster presented at the Joint Meeting of the Canadian Society for Brain, Behaviour, and Cognitive Sciences (CSBBCS) and the Experimental Psychology Society (EPS). St. Johns, Canada.</w:t>
       </w:r>
     </w:p>
     <w:p>

</xml_diff>